<commit_message>
Implement local Patentics retrieval and grounded Codex analysis for 0.2
</commit_message>
<xml_diff>
--- a/artifacts/http-download/cold-start.docx
+++ b/artifacts/http-download/cold-start.docx
@@ -15,7 +15,15 @@
         <w:pStyle w:val="Normal"/>
       </w:pPr>
       <w:r>
-        <w:t xml:space="preserve">任务 task-mu0jt6qn-l78bj｜查询版本 1｜分析更新时间 2026-09-14T01:12:34.654Z</w:t>
+        <w:t xml:space="preserve">报告编号 report-task-mu0mye02-hcqch-1｜报告版本 1</w:t>
+      </w:r>
+    </w:p>
+    <w:p>
+      <w:pPr>
+        <w:pStyle w:val="Normal"/>
+      </w:pPr>
+      <w:r>
+        <w:t xml:space="preserve">任务 task-mu0mye02-hcqch｜查询版本 1｜分析更新时间 2026-09-14T02:40:36.194Z</w:t>
       </w:r>
     </w:p>
     <w:p>
@@ -635,7 +643,7 @@
         <w:pStyle w:val="Normal"/>
       </w:pPr>
       <w:r>
-        <w:t xml:space="preserve">执行记录：规则处理 20.158 ms；实时模型调用 0 次；付费接口调用 0 次。耗时只对应当前环境和样本。</w:t>
+        <w:t xml:space="preserve">执行记录：规则处理 7.091 ms；实时模型调用 0 次；数据接口调用 0 次。耗时只对应当前环境和样本。</w:t>
       </w:r>
     </w:p>
     <w:sectPr>

</xml_diff>

<commit_message>
Complete five browser iterations and local deployment for 0.2.1
</commit_message>
<xml_diff>
--- a/artifacts/http-download/cold-start.docx
+++ b/artifacts/http-download/cold-start.docx
@@ -15,15 +15,15 @@
         <w:pStyle w:val="Normal"/>
       </w:pPr>
       <w:r>
-        <w:t xml:space="preserve">报告编号 report-task-mu0mye02-hcqch-1｜报告版本 1</w:t>
-      </w:r>
-    </w:p>
-    <w:p>
-      <w:pPr>
-        <w:pStyle w:val="Normal"/>
-      </w:pPr>
-      <w:r>
-        <w:t xml:space="preserve">任务 task-mu0mye02-hcqch｜查询版本 1｜分析更新时间 2026-09-14T02:40:36.194Z</w:t>
+        <w:t xml:space="preserve">报告编号 report-task-mu0ug620-2i6v8-1｜报告版本 1</w:t>
+      </w:r>
+    </w:p>
+    <w:p>
+      <w:pPr>
+        <w:pStyle w:val="Normal"/>
+      </w:pPr>
+      <w:r>
+        <w:t xml:space="preserve">任务 task-mu0ug620-2i6v8｜查询版本 1｜分析更新时间 2026-09-14T06:10:23.016Z</w:t>
       </w:r>
     </w:p>
     <w:p>
@@ -624,6 +624,117 @@
     </w:p>
     <w:p>
       <w:pPr>
+        <w:pStyle w:val="Heading2"/>
+      </w:pPr>
+      <w:r>
+        <w:t xml:space="preserve">保留方案横向对照</w:t>
+      </w:r>
+    </w:p>
+    <w:p>
+      <w:pPr>
+        <w:pStyle w:val="Normal"/>
+      </w:pPr>
+      <w:r>
+        <w:t xml:space="preserve">以下逐条对照当前证据的覆盖与归类，不表示性能高低。</w:t>
+      </w:r>
+    </w:p>
+    <w:p>
+      <w:pPr>
+        <w:pStyle w:val="Normal"/>
+      </w:pPr>
+      <w:r>
+        <w:t xml:space="preserve">US20050132745A1 No-vent liquid hydrogen storage and delivery system：原文覆盖 无正文，共 2 个片段。当前归类：主动制冷 </w:t>
+      </w:r>
+      <w:hyperlink w:anchor="ev1">
+        <w:r>
+          <w:rPr>
+            <w:color w:val="2563A0"/>
+          </w:rPr>
+          <w:t>[ev-US20050132745A1-c88c86a3]</w:t>
+        </w:r>
+      </w:hyperlink>
+      <w:r>
+        <w:t xml:space="preserve">。</w:t>
+      </w:r>
+    </w:p>
+    <w:p>
+      <w:pPr>
+        <w:pStyle w:val="Normal"/>
+      </w:pPr>
+      <w:r>
+        <w:t xml:space="preserve">US20070029330A1 Liquid hydrogen tank with a release pressure above the critical pressure：原文覆盖 无正文，共 1 个片段。当前归类：放气与气体利用 </w:t>
+      </w:r>
+      <w:hyperlink w:anchor="ev3">
+        <w:r>
+          <w:rPr>
+            <w:color w:val="2563A0"/>
+          </w:rPr>
+          <w:t>[ev-US20070029330A1-0ceecbb7]</w:t>
+        </w:r>
+      </w:hyperlink>
+      <w:r>
+        <w:t xml:space="preserve">。</w:t>
+      </w:r>
+    </w:p>
+    <w:p>
+      <w:pPr>
+        <w:pStyle w:val="Normal"/>
+      </w:pPr>
+      <w:r>
+        <w:t xml:space="preserve">US20240175550A1 Liquid Hydrogen Tank Control Device and Control Method Thereof：原文覆盖 说明书，共 1 个片段。当前归类：加热与增压 </w:t>
+      </w:r>
+      <w:hyperlink w:anchor="ev4">
+        <w:r>
+          <w:rPr>
+            <w:color w:val="2563A0"/>
+          </w:rPr>
+          <w:t>[ev-US20240175550A1-3bedfb99]</w:t>
+        </w:r>
+      </w:hyperlink>
+      <w:r>
+        <w:t xml:space="preserve">。</w:t>
+      </w:r>
+    </w:p>
+    <w:p>
+      <w:pPr>
+        <w:pStyle w:val="Normal"/>
+      </w:pPr>
+      <w:r>
+        <w:t xml:space="preserve">US20240178420A1 System for regulating pressure in liquid hydrogen fuel tank for a fuel cell electric vehicle：原文覆盖 无正文，共 1 个片段。当前归类：换热与喷淋 </w:t>
+      </w:r>
+      <w:hyperlink w:anchor="ev5">
+        <w:r>
+          <w:rPr>
+            <w:color w:val="2563A0"/>
+          </w:rPr>
+          <w:t>[ev-US20240178420A1-14a5ec26]</w:t>
+        </w:r>
+      </w:hyperlink>
+      <w:r>
+        <w:t xml:space="preserve">。</w:t>
+      </w:r>
+    </w:p>
+    <w:p>
+      <w:pPr>
+        <w:pStyle w:val="Normal"/>
+      </w:pPr>
+      <w:r>
+        <w:t xml:space="preserve">US20220136656A1 Systems and methods for storing liquid hydrogen：原文覆盖 说明书，共 1 个片段。当前归类：加热与增压 </w:t>
+      </w:r>
+      <w:hyperlink w:anchor="ev6">
+        <w:r>
+          <w:rPr>
+            <w:color w:val="2563A0"/>
+          </w:rPr>
+          <w:t>[ev-US20220136656A1-db62d1e6]</w:t>
+        </w:r>
+      </w:hyperlink>
+      <w:r>
+        <w:t xml:space="preserve">。</w:t>
+      </w:r>
+    </w:p>
+    <w:p>
+      <w:pPr>
         <w:pStyle w:val="Heading1"/>
       </w:pPr>
       <w:r>
@@ -643,7 +754,7 @@
         <w:pStyle w:val="Normal"/>
       </w:pPr>
       <w:r>
-        <w:t xml:space="preserve">执行记录：规则处理 7.091 ms；实时模型调用 0 次；数据接口调用 0 次。耗时只对应当前环境和样本。</w:t>
+        <w:t xml:space="preserve">执行记录：规则处理 7 ms；实时模型调用 0 次；数据接口调用 0 次。耗时只对应当前环境和样本。</w:t>
       </w:r>
     </w:p>
     <w:sectPr>

</xml_diff>